<commit_message>
docs: regenerar Word del informe de evaluacion con nota de actualizacion (02/06)
- gen-informe-word.js: fecha actualizada + caja verde con los 2 avances
  completados (seguridad 100% + staging/rollback) y conclusion
- Informe-Evaluacion-Procurador-SCW.docx regenerado y validado (ZIP/XML OK)

Word ahora consistente con el markdown.

Co-Authored-By: Claude Opus 4.8 <noreply@anthropic.com>
</commit_message>
<xml_diff>
--- a/docs/Informe-Evaluacion-Procurador-SCW.docx
+++ b/docs/Informe-Evaluacion-Procurador-SCW.docx
@@ -202,7 +202,7 @@
                 <w:sz w:val="21"/>
                 <w:szCs w:val="21"/>
               </w:rPr>
-              <w:t xml:space="preserve">30 de mayo de 2026</w:t>
+              <w:t xml:space="preserve">30 de mayo de 2026 · actualizado 02 de junio de 2026</w:t>
             </w:r>
           </w:p>
         </w:tc>
@@ -344,6 +344,113 @@
         </w:tc>
       </w:tr>
     </w:tbl>
+    <w:p>
+      <w:pPr>
+        <w:spacing w:after="160"/>
+      </w:pPr>
+    </w:p>
+    <w:p>
+      <w:pPr>
+        <w:pBdr>
+          <w:left w:val="single" w:color="059669" w:sz="18" w:space="8"/>
+        </w:pBdr>
+        <w:shd w:fill="D1FAE5" w:val="clear"/>
+        <w:spacing w:after="120" w:before="80" w:line="276"/>
+        <w:ind w:left="160" w:right="160"/>
+      </w:pPr>
+      <w:r>
+        <w:rPr>
+          <w:b/>
+          <w:bCs/>
+          <w:color w:val="064E3B"/>
+          <w:sz w:val="22"/>
+          <w:szCs w:val="22"/>
+        </w:rPr>
+        <w:t xml:space="preserve">Actualización (02/06/2026) — avances desde la versión original: </w:t>
+      </w:r>
+      <w:r>
+        <w:rPr>
+          <w:color w:val="064E3B"/>
+          <w:sz w:val="22"/>
+          <w:szCs w:val="22"/>
+        </w:rPr>
+        <w:t xml:space="preserve">dos puntos que figuraban como preparación post-Beta ya fueron completados anticipadamente, lo que refuerza la posición del proyecto:</w:t>
+      </w:r>
+    </w:p>
+    <w:p>
+      <w:pPr>
+        <w:pStyle w:val="ListParagraph"/>
+        <w:numPr>
+          <w:ilvl w:val="0"/>
+          <w:numId w:val="2"/>
+        </w:numPr>
+        <w:spacing w:after="80"/>
+        <w:ind w:left="540" w:hanging="260"/>
+      </w:pPr>
+      <w:r>
+        <w:rPr>
+          <w:b/>
+          <w:bCs/>
+          <w:color w:val="1A1A1A"/>
+          <w:sz w:val="22"/>
+          <w:szCs w:val="22"/>
+        </w:rPr>
+        <w:t xml:space="preserve">Endurecimiento de seguridad completo</w:t>
+      </w:r>
+      <w:r>
+        <w:rPr>
+          <w:color w:val="4A4A4A"/>
+          <w:sz w:val="22"/>
+          <w:szCs w:val="22"/>
+        </w:rPr>
+        <w:t xml:space="preserve"> — se revisó y corrigió la totalidad de los puntos de seguridad detectados. Solo resta una auditoría externa opcional antes de la escala masiva.</w:t>
+      </w:r>
+    </w:p>
+    <w:p>
+      <w:pPr>
+        <w:pStyle w:val="ListParagraph"/>
+        <w:numPr>
+          <w:ilvl w:val="0"/>
+          <w:numId w:val="2"/>
+        </w:numPr>
+        <w:spacing w:after="80"/>
+        <w:ind w:left="540" w:hanging="260"/>
+      </w:pPr>
+      <w:r>
+        <w:rPr>
+          <w:b/>
+          <w:bCs/>
+          <w:color w:val="1A1A1A"/>
+          <w:sz w:val="22"/>
+          <w:szCs w:val="22"/>
+        </w:rPr>
+        <w:t xml:space="preserve">Ambiente de pruebas (staging) + recuperación ante fallas</w:t>
+      </w:r>
+      <w:r>
+        <w:rPr>
+          <w:color w:val="4A4A4A"/>
+          <w:sz w:val="22"/>
+          <w:szCs w:val="22"/>
+        </w:rPr>
+        <w:t xml:space="preserve"> — entorno gemelo aislado para probar cambios sin riesgo, con respaldos automáticos y un procedimiento de “vuelta atrás” probado. Reduce significativamente el riesgo operativo de la Beta.</w:t>
+      </w:r>
+    </w:p>
+    <w:p>
+      <w:pPr>
+        <w:spacing w:after="80" w:before="40" w:line="276"/>
+        <w:ind w:left="160"/>
+      </w:pPr>
+      <w:r>
+        <w:rPr>
+          <w:i/>
+          <w:iCs/>
+          <w:color w:val="4A4A4A"/>
+          <w:sz w:val="22"/>
+          <w:szCs w:val="22"/>
+        </w:rPr>
+        <w:t xml:space="preserve">Con esto, los únicos pendientes para abrir la Beta son trámites externos (activar cobros reales y firmar digitalmente el instalador).</w:t>
+      </w:r>
+    </w:p>
     <w:p>
       <w:r>
         <w:br w:type="page"/>
@@ -1451,7 +1558,7 @@
         <w:pStyle w:val="ListParagraph"/>
         <w:numPr>
           <w:ilvl w:val="0"/>
-          <w:numId w:val="2"/>
+          <w:numId w:val="3"/>
         </w:numPr>
         <w:spacing w:after="80"/>
       </w:pPr>
@@ -1469,7 +1576,7 @@
         <w:pStyle w:val="ListParagraph"/>
         <w:numPr>
           <w:ilvl w:val="0"/>
-          <w:numId w:val="2"/>
+          <w:numId w:val="3"/>
         </w:numPr>
         <w:spacing w:after="80"/>
       </w:pPr>
@@ -1487,7 +1594,7 @@
         <w:pStyle w:val="ListParagraph"/>
         <w:numPr>
           <w:ilvl w:val="0"/>
-          <w:numId w:val="2"/>
+          <w:numId w:val="3"/>
         </w:numPr>
         <w:spacing w:after="80"/>
       </w:pPr>
@@ -1534,7 +1641,7 @@
         <w:pStyle w:val="ListParagraph"/>
         <w:numPr>
           <w:ilvl w:val="0"/>
-          <w:numId w:val="2"/>
+          <w:numId w:val="3"/>
         </w:numPr>
         <w:spacing w:after="80"/>
       </w:pPr>
@@ -1552,7 +1659,7 @@
         <w:pStyle w:val="ListParagraph"/>
         <w:numPr>
           <w:ilvl w:val="0"/>
-          <w:numId w:val="2"/>
+          <w:numId w:val="3"/>
         </w:numPr>
         <w:spacing w:after="80"/>
       </w:pPr>
@@ -1570,7 +1677,7 @@
         <w:pStyle w:val="ListParagraph"/>
         <w:numPr>
           <w:ilvl w:val="0"/>
-          <w:numId w:val="2"/>
+          <w:numId w:val="3"/>
         </w:numPr>
         <w:spacing w:after="80"/>
       </w:pPr>
@@ -1596,7 +1703,7 @@
         <w:pStyle w:val="ListParagraph"/>
         <w:numPr>
           <w:ilvl w:val="0"/>
-          <w:numId w:val="2"/>
+          <w:numId w:val="3"/>
         </w:numPr>
         <w:spacing w:after="80"/>
       </w:pPr>
@@ -1614,7 +1721,7 @@
         <w:pStyle w:val="ListParagraph"/>
         <w:numPr>
           <w:ilvl w:val="0"/>
-          <w:numId w:val="2"/>
+          <w:numId w:val="3"/>
         </w:numPr>
         <w:spacing w:after="80"/>
       </w:pPr>
@@ -2087,7 +2194,7 @@
         <w:pStyle w:val="ListParagraph"/>
         <w:numPr>
           <w:ilvl w:val="0"/>
-          <w:numId w:val="2"/>
+          <w:numId w:val="3"/>
         </w:numPr>
         <w:spacing w:after="80"/>
       </w:pPr>
@@ -2105,7 +2212,7 @@
         <w:pStyle w:val="ListParagraph"/>
         <w:numPr>
           <w:ilvl w:val="0"/>
-          <w:numId w:val="2"/>
+          <w:numId w:val="3"/>
         </w:numPr>
         <w:spacing w:after="80"/>
       </w:pPr>
@@ -3437,7 +3544,7 @@
         <w:pStyle w:val="ListParagraph"/>
         <w:numPr>
           <w:ilvl w:val="0"/>
-          <w:numId w:val="3"/>
+          <w:numId w:val="2"/>
         </w:numPr>
         <w:spacing w:after="80"/>
       </w:pPr>
@@ -3465,7 +3572,7 @@
         <w:pStyle w:val="ListParagraph"/>
         <w:numPr>
           <w:ilvl w:val="0"/>
-          <w:numId w:val="3"/>
+          <w:numId w:val="2"/>
         </w:numPr>
         <w:spacing w:after="80"/>
       </w:pPr>
@@ -3493,7 +3600,7 @@
         <w:pStyle w:val="ListParagraph"/>
         <w:numPr>
           <w:ilvl w:val="0"/>
-          <w:numId w:val="3"/>
+          <w:numId w:val="2"/>
         </w:numPr>
         <w:spacing w:after="80"/>
       </w:pPr>
@@ -3521,7 +3628,7 @@
         <w:pStyle w:val="ListParagraph"/>
         <w:numPr>
           <w:ilvl w:val="0"/>
-          <w:numId w:val="3"/>
+          <w:numId w:val="2"/>
         </w:numPr>
         <w:spacing w:after="80"/>
       </w:pPr>
@@ -3862,13 +3969,13 @@
     </w:lvlOverride>
   </w:num>
   <w:num w:numId="2">
-    <w:abstractNumId w:val="2"/>
+    <w:abstractNumId w:val="3"/>
     <w:lvlOverride w:ilvl="0">
       <w:startOverride w:val="1"/>
     </w:lvlOverride>
   </w:num>
   <w:num w:numId="3">
-    <w:abstractNumId w:val="3"/>
+    <w:abstractNumId w:val="2"/>
     <w:lvlOverride w:ilvl="0">
       <w:startOverride w:val="1"/>
     </w:lvlOverride>

</xml_diff>